<commit_message>
docs: remove redundant USC15 from TOC and content in DacTaUseCase.md and DacTaUseCase.docx
</commit_message>
<xml_diff>
--- a/docs/requirements/assets/DacTaUseCase.docx
+++ b/docs/requirements/assets/DacTaUseCase.docx
@@ -20395,292 +20395,6 @@
         </w:rPr>
       </w:pPr>
       <w:r/>
-    </w:p>
-    <w:p>
-      <w:pPr>
-        <w:pStyle w:val="Heading2"/>
-      </w:pPr>
-      <w:r>
-        <w:t>3.15 USC15 — Lưu Trữ &amp; Phân Phối Tệp Âm Thanh</w:t>
-      </w:r>
-    </w:p>
-    <w:p>
-      <w:r>
-        <w:rPr>
-          <w:i/>
-        </w:rPr>
-        <w:t>Sơ đồ Use Case — USC15</w:t>
-      </w:r>
-    </w:p>
-    <w:tbl>
-      <w:tblPr>
-        <w:tblW w:type="auto" w:w="0"/>
-        <w:jc w:val="center"/>
-        <w:tblLook w:firstColumn="1" w:firstRow="1" w:lastColumn="0" w:lastRow="0" w:noHBand="0" w:noVBand="1" w:val="04A0"/>
-      </w:tblPr>
-      <w:tblGrid>
-        <w:gridCol w:w="4680"/>
-        <w:gridCol w:w="4680"/>
-      </w:tblGrid>
-      <w:tr>
-        <w:tc>
-          <w:tcPr>
-            <w:tcW w:type="dxa" w:w="4680"/>
-          </w:tcPr>
-          <w:p>
-            <w:r>
-              <w:rPr>
-                <w:b/>
-              </w:rPr>
-              <w:t>USC15: Lưu Trữ &amp; Phân Phối Tệp Âm Thanh (LuuTruVaPhanPhoiTepAmThanh)</w:t>
-            </w:r>
-          </w:p>
-        </w:tc>
-        <w:tc>
-          <w:tcPr>
-            <w:tcW w:type="dxa" w:w="4680"/>
-          </w:tcPr>
-          <w:p>
-            <w:r>
-              <w:rPr>
-                <w:b/>
-              </w:rPr>
-              <w:t>USC15: Lưu Trữ &amp; Phân Phối Tệp Âm Thanh (LuuTruVaPhanPhoiTepAmThanh)</w:t>
-            </w:r>
-          </w:p>
-        </w:tc>
-      </w:tr>
-      <w:tr>
-        <w:tc>
-          <w:tcPr>
-            <w:tcW w:type="dxa" w:w="4680"/>
-          </w:tcPr>
-          <w:p>
-            <w:r>
-              <w:t>Tác nhân (Actor):</w:t>
-            </w:r>
-          </w:p>
-        </w:tc>
-        <w:tc>
-          <w:tcPr>
-            <w:tcW w:type="dxa" w:w="4680"/>
-          </w:tcPr>
-          <w:p>
-            <w:r>
-              <w:t>Admin, Thiết Bị Lưu Âm Thanh (Web CDN / Static Audio Server)</w:t>
-            </w:r>
-          </w:p>
-        </w:tc>
-      </w:tr>
-      <w:tr>
-        <w:tc>
-          <w:tcPr>
-            <w:tcW w:type="dxa" w:w="4680"/>
-          </w:tcPr>
-          <w:p>
-            <w:r>
-              <w:t>Mức độ hoàn thiện:</w:t>
-            </w:r>
-          </w:p>
-        </w:tc>
-        <w:tc>
-          <w:tcPr>
-            <w:tcW w:type="dxa" w:w="4680"/>
-          </w:tcPr>
-          <w:p>
-            <w:r>
-              <w:t>Focused</w:t>
-            </w:r>
-          </w:p>
-        </w:tc>
-      </w:tr>
-      <w:tr>
-        <w:tc>
-          <w:tcPr>
-            <w:tcW w:type="dxa" w:w="4680"/>
-          </w:tcPr>
-          <w:p>
-            <w:r>
-              <w:t>Mô tả tóm tắt:</w:t>
-            </w:r>
-          </w:p>
-        </w:tc>
-        <w:tc>
-          <w:tcPr>
-            <w:tcW w:type="dxa" w:w="4680"/>
-          </w:tcPr>
-          <w:p>
-            <w:r>
-              <w:t>Lưu trữ và phân phối tệp âm thanh thuyết minh tĩnh (kèm thông tin hiện vật, ngôn ngữ) lên Thiết Bị Lưu Âm Thanh / Web CDN để phục vụ việc phát luồng qua giao thức HTTP/HTTPS. Use case này phối hợp cùng {Quản Lý Tệp Âm Thanh} («include») để nhận tệp và thông tin do Admin cung cấp.</w:t>
-            </w:r>
-          </w:p>
-        </w:tc>
-      </w:tr>
-      <w:tr>
-        <w:tc>
-          <w:tcPr>
-            <w:tcW w:type="dxa" w:w="4680"/>
-          </w:tcPr>
-          <w:p>
-            <w:r>
-              <w:t>Điều kiện tiên quyết:</w:t>
-            </w:r>
-          </w:p>
-        </w:tc>
-        <w:tc>
-          <w:tcPr>
-            <w:tcW w:type="dxa" w:w="4680"/>
-          </w:tcPr>
-          <w:p>
-            <w:r>
-              <w:t>- Thiết Bị Lưu Âm Thanh / Web CDN sẵn sàng tiếp nhận và phục vụ tệp.</w:t>
-              <w:br/>
-              <w:t>- Tệp âm thanh và thông tin kèm theo đã được Admin cung cấp qua {Quản Lý Tệp Âm Thanh}.</w:t>
-            </w:r>
-          </w:p>
-        </w:tc>
-      </w:tr>
-      <w:tr>
-        <w:tc>
-          <w:tcPr>
-            <w:tcW w:type="dxa" w:w="4680"/>
-          </w:tcPr>
-          <w:p>
-            <w:r>
-              <w:t>Dòng sự kiện chính:</w:t>
-            </w:r>
-          </w:p>
-        </w:tc>
-        <w:tc>
-          <w:tcPr>
-            <w:tcW w:type="dxa" w:w="4680"/>
-          </w:tcPr>
-          <w:p>
-            <w:r>
-              <w:t>1. Hệ thống tiếp nhận tệp âm thanh thuyết minh và thông tin kèm theo (hiện vật, ngôn ngữ) từ use case {Quản Lý Tệp Âm Thanh}.</w:t>
-              <w:br/>
-              <w:t>2. Hệ thống kiểm tra tệp: đúng định dạng âm thanh (.mp3) và dung lượng trong giới hạn cho phép (E1).</w:t>
-              <w:br/>
-              <w:t>3. Hệ thống kiểm tra tệp đã tồn tại chưa (A1), tạo ID tệp và gửi yêu cầu lưu kèm dữ liệu đến kho lưu trữ.</w:t>
-              <w:br/>
-              <w:t>4. Thiết Bị Lưu Âm Thanh / Kho lưu trữ kiểm tra hạn mức dung lượng trống (E2).</w:t>
-              <w:br/>
-              <w:t>5. Thiết bị ghi tệp lên bộ nhớ và kiểm tra tính toàn vẹn (E3).</w:t>
-              <w:br/>
-              <w:t>6. Thiết bị trả kết quả thành công kèm đường dẫn URL tệp audio.</w:t>
-              <w:br/>
-              <w:t>7. Hệ thống cập nhật thông tin đường dẫn tệp vào CSDL/Store và thông báo "Lưu tệp âm thanh thành công". Use case kết thúc.</w:t>
-            </w:r>
-          </w:p>
-        </w:tc>
-      </w:tr>
-      <w:tr>
-        <w:tc>
-          <w:tcPr>
-            <w:tcW w:type="dxa" w:w="4680"/>
-          </w:tcPr>
-          <w:p>
-            <w:r>
-              <w:t>Luồng thay thế (Alternative):</w:t>
-            </w:r>
-          </w:p>
-        </w:tc>
-        <w:tc>
-          <w:tcPr>
-            <w:tcW w:type="dxa" w:w="4680"/>
-          </w:tcPr>
-          <w:p>
-            <w:r>
-              <w:t>A1 - Ghi đè/thay thế tệp đã có: Tại bước 3, nếu đã tồn tại tệp cùng hiện vật và ngôn ngữ, hệ thống cho phép ghi đè tệp mới; tệp cũ chỉ bị thay thế sau khi tệp mới lưu thành công.</w:t>
-            </w:r>
-          </w:p>
-        </w:tc>
-      </w:tr>
-      <w:tr>
-        <w:tc>
-          <w:tcPr>
-            <w:tcW w:type="dxa" w:w="4680"/>
-          </w:tcPr>
-          <w:p>
-            <w:r>
-              <w:t>Luồng ngoại lệ (Exception):</w:t>
-            </w:r>
-          </w:p>
-        </w:tc>
-        <w:tc>
-          <w:tcPr>
-            <w:tcW w:type="dxa" w:w="4680"/>
-          </w:tcPr>
-          <w:p>
-            <w:r>
-              <w:t>E1 - Tệp không hợp lệ: Sai định dạng âm thanh hoặc vượt dung lượng cho phép. Hệ thống báo lỗi và hủy thao tác.</w:t>
-              <w:br/>
-              <w:t>E2 - Hết dung lượng lưu trữ: Hệ thống thông báo lỗi không đủ dung lượng.</w:t>
-              <w:br/>
-              <w:t>E3 - Ghi tệp thất bại hoặc mất kết nối: Hệ thống tự động thử lại, nếu không thành công thì hủy phần tệp ghi dở và báo lỗi.</w:t>
-            </w:r>
-          </w:p>
-        </w:tc>
-      </w:tr>
-      <w:tr>
-        <w:tc>
-          <w:tcPr>
-            <w:tcW w:type="dxa" w:w="4680"/>
-          </w:tcPr>
-          <w:p>
-            <w:r>
-              <w:t>Điều kiện kết thúc:</w:t>
-            </w:r>
-          </w:p>
-        </w:tc>
-        <w:tc>
-          <w:tcPr>
-            <w:tcW w:type="dxa" w:w="4680"/>
-          </w:tcPr>
-          <w:p>
-            <w:r>
-              <w:t>Thành công: Tệp âm thanh được lưu đầy đủ trên kho lưu trữ và đường dẫn tệp được cập nhật vào CSDL/Store.</w:t>
-              <w:br/>
-              <w:t>Thất bại: Không lưu được tệp; hệ thống không giữ lại tệp ghi dở.</w:t>
-            </w:r>
-          </w:p>
-        </w:tc>
-      </w:tr>
-      <w:tr>
-        <w:tc>
-          <w:tcPr>
-            <w:tcW w:type="dxa" w:w="4680"/>
-          </w:tcPr>
-          <w:p>
-            <w:r>
-              <w:t>Sự kiện kích hoạt (Trigger):</w:t>
-            </w:r>
-          </w:p>
-        </w:tc>
-        <w:tc>
-          <w:tcPr>
-            <w:tcW w:type="dxa" w:w="4680"/>
-          </w:tcPr>
-          <w:p>
-            <w:r>
-              <w:t>Admin thêm mới hoặc cập nhật tệp âm thanh thuyết minh cho hiện vật.</w:t>
-            </w:r>
-          </w:p>
-        </w:tc>
-      </w:tr>
-    </w:tbl>
-    <w:p>
-      <w:r>
-        <w:rPr>
-          <w:i/>
-        </w:rPr>
-        <w:t>Sơ đồ hoạt động (Activity Diagram) — USC15</w:t>
-      </w:r>
-    </w:p>
-    <w:p>
-      <w:r>
-        <w:t>Tiến trình: Nhận tệp âm thanh &amp; metadata -&gt; Kiểm tra định dạng audio -&gt; Kiểm tra hạn mức dung lượng -&gt; Ghi tệp toàn vẹn -&gt; Cập nhật URL vào CSDL / Data Store -&gt; Thông báo thành công.</w:t>
-      </w:r>
     </w:p>
     <w:p>
       <w:pPr>

</xml_diff>

<commit_message>
docs: remove USC15 from Word SDT Table of Contents and sync titles
</commit_message>
<xml_diff>
--- a/docs/requirements/assets/DacTaUseCase.docx
+++ b/docs/requirements/assets/DacTaUseCase.docx
@@ -966,7 +966,7 @@
                 <w:rStyle w:val="Hyperlink"/>
                 <w:noProof/>
               </w:rPr>
-              <w:t>3.10 USC10 — Chỉnh Sửa Mã QR</w:t>
+              <w:t>3.10 USC10 — Quản Lý Phiên Tham Quan &amp; Mã QR</w:t>
             </w:r>
             <w:r>
               <w:rPr>
@@ -1222,7 +1222,7 @@
                 <w:rStyle w:val="Hyperlink"/>
                 <w:noProof/>
               </w:rPr>
-              <w:t>3.14 USC14 — Phát Luồng Dữ Liệu Âm Thanh</w:t>
+              <w:t>3.14 USC14 — Định Vị Vị Trí &amp; Tự Động Thuyết Minh</w:t>
             </w:r>
             <w:r>
               <w:rPr>
@@ -1258,70 +1258,6 @@
                 <w:noProof/>
               </w:rPr>
               <w:t>43</w:t>
-            </w:r>
-            <w:r>
-              <w:rPr>
-                <w:noProof/>
-              </w:rPr>
-              <w:fldChar w:fldCharType="end"/>
-            </w:r>
-          </w:hyperlink>
-        </w:p>
-        <w:p>
-          <w:pPr>
-            <w:pStyle w:val="TOC2"/>
-            <w:tabs>
-              <w:tab w:val="right" w:leader="dot" w:pos="9350"/>
-            </w:tabs>
-            <w:rPr>
-              <w:rFonts w:asciiTheme="minorHAnsi" w:eastAsiaTheme="minorEastAsia" w:hAnsiTheme="minorHAnsi" w:cstheme="minorBidi"/>
-              <w:noProof/>
-              <w:sz w:val="22"/>
-              <w:szCs w:val="22"/>
-            </w:rPr>
-          </w:pPr>
-          <w:hyperlink w:anchor="_Toc243643263" w:history="1">
-            <w:r>
-              <w:rPr>
-                <w:rStyle w:val="Hyperlink"/>
-                <w:noProof/>
-              </w:rPr>
-              <w:t>3.15 USC15 — Lưu Trữ Tệp Âm Thanh</w:t>
-            </w:r>
-            <w:r>
-              <w:rPr>
-                <w:noProof/>
-              </w:rPr>
-              <w:tab/>
-            </w:r>
-            <w:r>
-              <w:rPr>
-                <w:noProof/>
-              </w:rPr>
-              <w:fldChar w:fldCharType="begin"/>
-            </w:r>
-            <w:r>
-              <w:rPr>
-                <w:noProof/>
-              </w:rPr>
-              <w:instrText xml:space="preserve"> PAGEREF _Toc243643263 \h </w:instrText>
-            </w:r>
-            <w:r>
-              <w:rPr>
-                <w:noProof/>
-              </w:rPr>
-            </w:r>
-            <w:r>
-              <w:rPr>
-                <w:noProof/>
-              </w:rPr>
-              <w:fldChar w:fldCharType="separate"/>
-            </w:r>
-            <w:r>
-              <w:rPr>
-                <w:noProof/>
-              </w:rPr>
-              <w:t>46</w:t>
             </w:r>
             <w:r>
               <w:rPr>

</xml_diff>

<commit_message>
docs: finalize 100% synchronization of section titles, TOC, and table headers across MD and DOCX
</commit_message>
<xml_diff>
--- a/docs/requirements/assets/DacTaUseCase.docx
+++ b/docs/requirements/assets/DacTaUseCase.docx
@@ -710,7 +710,7 @@
                 <w:rStyle w:val="Hyperlink"/>
                 <w:noProof/>
               </w:rPr>
-              <w:t>3.6 USC6 — Xem Hồ Sơ Bảo Tàng</w:t>
+              <w:t>3.6 USC06 — Xem Hồ Sơ Bảo Tàng</w:t>
             </w:r>
             <w:r>
               <w:rPr>
@@ -7053,27 +7053,9 @@
         <w:pStyle w:val="Heading2"/>
         <w:spacing w:before="260" w:after="120"/>
       </w:pPr>
-      <w:bookmarkStart w:id="9" w:name="_Toc243643254"/>
       <w:r>
-        <w:lastRenderedPageBreak/>
-        <w:t>3</w:t>
+        <w:t>3.6 USC06 — Xem Hồ Sơ Bảo Tàng</w:t>
       </w:r>
-      <w:r>
-        <w:t>.6</w:t>
-      </w:r>
-      <w:r>
-        <w:t xml:space="preserve"> U</w:t>
-      </w:r>
-      <w:r>
-        <w:t>S</w:t>
-      </w:r>
-      <w:r>
-        <w:t>C6</w:t>
-      </w:r>
-      <w:r>
-        <w:t xml:space="preserve"> — Xem Hồ Sơ Bảo Tàng</w:t>
-      </w:r>
-      <w:bookmarkEnd w:id="9"/>
     </w:p>
     <w:p>
       <w:pPr>
@@ -8325,31 +8307,8 @@
             <w:shd w:val="clear" w:color="auto" w:fill="2F5496"/>
           </w:tcPr>
           <w:p>
-            <w:pPr>
-              <w:rPr>
-                <w:sz w:val="26"/>
-                <w:szCs w:val="26"/>
-              </w:rPr>
-            </w:pPr>
-            <w:r>
-              <w:rPr>
-                <w:b/>
-                <w:bCs/>
-                <w:color w:val="FFFFFF"/>
-                <w:sz w:val="26"/>
-                <w:szCs w:val="26"/>
-              </w:rPr>
-              <w:t>USC18</w:t>
-            </w:r>
-            <w:r>
-              <w:rPr>
-                <w:b/>
-                <w:bCs/>
-                <w:color w:val="FFFFFF"/>
-                <w:sz w:val="26"/>
-                <w:szCs w:val="26"/>
-              </w:rPr>
-              <w:t>: Xem Phụ Đề (XemPhuDe)</w:t>
+            <w:r>
+              <w:t>USC07: Xem Phụ Đề (XemPhuDe)</w:t>
             </w:r>
           </w:p>
         </w:tc>
@@ -9420,41 +9379,8 @@
             <w:shd w:val="clear" w:color="auto" w:fill="2F5496"/>
           </w:tcPr>
           <w:p>
-            <w:pPr>
-              <w:rPr>
-                <w:sz w:val="26"/>
-                <w:szCs w:val="26"/>
-              </w:rPr>
-            </w:pPr>
-            <w:r>
-              <w:rPr>
-                <w:b/>
-                <w:bCs/>
-                <w:color w:val="FFFFFF"/>
-                <w:sz w:val="26"/>
-                <w:szCs w:val="26"/>
-              </w:rPr>
-              <w:t>U</w:t>
-            </w:r>
-            <w:r>
-              <w:rPr>
-                <w:b/>
-                <w:bCs/>
-                <w:color w:val="FFFFFF"/>
-                <w:sz w:val="26"/>
-                <w:szCs w:val="26"/>
-              </w:rPr>
-              <w:t>S</w:t>
-            </w:r>
-            <w:r>
-              <w:rPr>
-                <w:b/>
-                <w:bCs/>
-                <w:color w:val="FFFFFF"/>
-                <w:sz w:val="26"/>
-                <w:szCs w:val="26"/>
-              </w:rPr>
-              <w:t>C15: Tìm Kiếm (TimKiem)</w:t>
+            <w:r>
+              <w:t>USC08: Tìm Kiếm (TimKiem)</w:t>
             </w:r>
           </w:p>
         </w:tc>
@@ -10623,62 +10549,8 @@
             </w:tcMar>
           </w:tcPr>
           <w:p>
-            <w:pPr>
-              <w:spacing w:after="40"/>
-              <w:rPr>
-                <w:sz w:val="26"/>
-                <w:szCs w:val="26"/>
-              </w:rPr>
-            </w:pPr>
-            <w:r>
-              <w:rPr>
-                <w:b/>
-                <w:bCs/>
-                <w:color w:val="FFFFFF"/>
-                <w:sz w:val="26"/>
-                <w:szCs w:val="26"/>
-              </w:rPr>
-              <w:t>U</w:t>
-            </w:r>
-            <w:r>
-              <w:rPr>
-                <w:b/>
-                <w:bCs/>
-                <w:color w:val="FFFFFF"/>
-                <w:sz w:val="26"/>
-                <w:szCs w:val="26"/>
-              </w:rPr>
-              <w:t>S</w:t>
-            </w:r>
-            <w:r>
-              <w:rPr>
-                <w:b/>
-                <w:bCs/>
-                <w:color w:val="FFFFFF"/>
-                <w:sz w:val="26"/>
-                <w:szCs w:val="26"/>
-              </w:rPr>
-              <w:t>C</w:t>
-            </w:r>
-            <w:r>
-              <w:rPr>
-                <w:b/>
-                <w:bCs/>
-                <w:color w:val="FFFFFF"/>
-                <w:sz w:val="26"/>
-                <w:szCs w:val="26"/>
-              </w:rPr>
-              <w:t>07</w:t>
-            </w:r>
-            <w:r>
-              <w:rPr>
-                <w:b/>
-                <w:bCs/>
-                <w:color w:val="FFFFFF"/>
-                <w:sz w:val="26"/>
-                <w:szCs w:val="26"/>
-              </w:rPr>
-              <w:t>: Quản Lý Sự Vật (QLSuVat)</w:t>
+            <w:r>
+              <w:t>USC09: Quản Lý Sự Vật (QLSuVat)</w:t>
             </w:r>
           </w:p>
         </w:tc>
@@ -15502,42 +15374,8 @@
             </w:tcMar>
           </w:tcPr>
           <w:p>
-            <w:pPr>
-              <w:spacing w:after="40"/>
-              <w:rPr>
-                <w:sz w:val="26"/>
-                <w:szCs w:val="26"/>
-              </w:rPr>
-            </w:pPr>
-            <w:r>
-              <w:rPr>
-                <w:b/>
-                <w:bCs/>
-                <w:color w:val="FFFFFF"/>
-                <w:sz w:val="26"/>
-                <w:szCs w:val="26"/>
-              </w:rPr>
-              <w:t>U</w:t>
-            </w:r>
-            <w:r>
-              <w:rPr>
-                <w:b/>
-                <w:bCs/>
-                <w:color w:val="FFFFFF"/>
-                <w:sz w:val="26"/>
-                <w:szCs w:val="26"/>
-              </w:rPr>
-              <w:t>S</w:t>
-            </w:r>
-            <w:r>
-              <w:rPr>
-                <w:b/>
-                <w:bCs/>
-                <w:color w:val="FFFFFF"/>
-                <w:sz w:val="26"/>
-                <w:szCs w:val="26"/>
-              </w:rPr>
-              <w:t>C10: Xem Thống Kê Lượt Nghe (XemThongKeLuotNghe)</w:t>
+            <w:r>
+              <w:t>USC12: Xem Thống Kê Lượt Nghe (XemThongKeLuotNghe)</w:t>
             </w:r>
           </w:p>
         </w:tc>
@@ -17022,42 +16860,8 @@
             </w:tcMar>
           </w:tcPr>
           <w:p>
-            <w:pPr>
-              <w:spacing w:after="40"/>
-              <w:rPr>
-                <w:sz w:val="26"/>
-                <w:szCs w:val="26"/>
-              </w:rPr>
-            </w:pPr>
-            <w:r>
-              <w:rPr>
-                <w:b/>
-                <w:bCs/>
-                <w:color w:val="FFFFFF"/>
-                <w:sz w:val="26"/>
-                <w:szCs w:val="26"/>
-              </w:rPr>
-              <w:t>U</w:t>
-            </w:r>
-            <w:r>
-              <w:rPr>
-                <w:b/>
-                <w:bCs/>
-                <w:color w:val="FFFFFF"/>
-                <w:sz w:val="26"/>
-                <w:szCs w:val="26"/>
-              </w:rPr>
-              <w:t>S</w:t>
-            </w:r>
-            <w:r>
-              <w:rPr>
-                <w:b/>
-                <w:bCs/>
-                <w:color w:val="FFFFFF"/>
-                <w:sz w:val="26"/>
-                <w:szCs w:val="26"/>
-              </w:rPr>
-              <w:t>C11: Quản Lý Sơ Đồ (QLSoDo)</w:t>
+            <w:r>
+              <w:t>USC13: Quản Lý Sơ Đồ (QLSoDo)</w:t>
             </w:r>
           </w:p>
         </w:tc>

</xml_diff>

<commit_message>
ui: remove tracking status bar and low-accuracy warning banners from visitor layout
</commit_message>
<xml_diff>
--- a/docs/requirements/assets/DacTaUseCase.docx
+++ b/docs/requirements/assets/DacTaUseCase.docx
@@ -1,6 +1,6 @@
 
 <file path=word/document.xml><?xml version="1.0" encoding="utf-8"?>
-<w:document xmlns:wpc="http://schemas.microsoft.com/office/word/2010/wordprocessingCanvas" xmlns:mc="http://schemas.openxmlformats.org/markup-compatibility/2006" xmlns:o="urn:schemas-microsoft-com:office:office" xmlns:r="http://schemas.openxmlformats.org/officeDocument/2006/relationships" xmlns:m="http://schemas.openxmlformats.org/officeDocument/2006/math" xmlns:v="urn:schemas-microsoft-com:vml" xmlns:wp14="http://schemas.microsoft.com/office/word/2010/wordprocessingDrawing" xmlns:wp="http://schemas.openxmlformats.org/drawingml/2006/wordprocessingDrawing" xmlns:w10="urn:schemas-microsoft-com:office:word" xmlns:w="http://schemas.openxmlformats.org/wordprocessingml/2006/main" xmlns:w14="http://schemas.microsoft.com/office/word/2010/wordml" xmlns:w15="http://schemas.microsoft.com/office/word/2012/wordml" xmlns:wpg="http://schemas.microsoft.com/office/word/2010/wordprocessingGroup" xmlns:wpi="http://schemas.microsoft.com/office/word/2010/wordprocessingInk" xmlns:wne="http://schemas.microsoft.com/office/word/2006/wordml" xmlns:wps="http://schemas.microsoft.com/office/word/2010/wordprocessingShape" mc:Ignorable="w14 w15 wp14">
+<w:document xmlns:wpc="http://schemas.microsoft.com/office/word/2010/wordprocessingCanvas" xmlns:cx="http://schemas.microsoft.com/office/drawing/2014/chartex" xmlns:cx1="http://schemas.microsoft.com/office/drawing/2015/9/8/chartex" xmlns:cx2="http://schemas.microsoft.com/office/drawing/2015/10/21/chartex" xmlns:cx3="http://schemas.microsoft.com/office/drawing/2016/5/9/chartex" xmlns:cx4="http://schemas.microsoft.com/office/drawing/2016/5/10/chartex" xmlns:cx5="http://schemas.microsoft.com/office/drawing/2016/5/11/chartex" xmlns:cx6="http://schemas.microsoft.com/office/drawing/2016/5/12/chartex" xmlns:cx7="http://schemas.microsoft.com/office/drawing/2016/5/13/chartex" xmlns:cx8="http://schemas.microsoft.com/office/drawing/2016/5/14/chartex" xmlns:mc="http://schemas.openxmlformats.org/markup-compatibility/2006" xmlns:aink="http://schemas.microsoft.com/office/drawing/2016/ink" xmlns:am3d="http://schemas.microsoft.com/office/drawing/2017/model3d" xmlns:o="urn:schemas-microsoft-com:office:office" xmlns:oel="http://schemas.microsoft.com/office/2019/extlst" xmlns:r="http://schemas.openxmlformats.org/officeDocument/2006/relationships" xmlns:m="http://schemas.openxmlformats.org/officeDocument/2006/math" xmlns:v="urn:schemas-microsoft-com:vml" xmlns:wp14="http://schemas.microsoft.com/office/word/2010/wordprocessingDrawing" xmlns:wp="http://schemas.openxmlformats.org/drawingml/2006/wordprocessingDrawing" xmlns:w10="urn:schemas-microsoft-com:office:word" xmlns:w="http://schemas.openxmlformats.org/wordprocessingml/2006/main" xmlns:w14="http://schemas.microsoft.com/office/word/2010/wordml" xmlns:w15="http://schemas.microsoft.com/office/word/2012/wordml" xmlns:w16cex="http://schemas.microsoft.com/office/word/2018/wordml/cex" xmlns:w16cid="http://schemas.microsoft.com/office/word/2016/wordml/cid" xmlns:w16="http://schemas.microsoft.com/office/word/2018/wordml" xmlns:w16du="http://schemas.microsoft.com/office/word/2023/wordml/word16du" xmlns:w16sdtdh="http://schemas.microsoft.com/office/word/2020/wordml/sdtdatahash" xmlns:w16sdtfl="http://schemas.microsoft.com/office/word/2024/wordml/sdtformatlock" xmlns:w16se="http://schemas.microsoft.com/office/word/2015/wordml/symex" xmlns:wpg="http://schemas.microsoft.com/office/word/2010/wordprocessingGroup" xmlns:wpi="http://schemas.microsoft.com/office/word/2010/wordprocessingInk" xmlns:wne="http://schemas.microsoft.com/office/word/2006/wordml" xmlns:wps="http://schemas.microsoft.com/office/word/2010/wordprocessingShape" mc:Ignorable="w14 w15 w16se w16cid w16 w16cex w16sdtdh w16sdtfl w16du wp14">
   <w:body>
     <w:p>
       <w:pPr>
@@ -1351,7 +1351,7 @@
           <w:szCs w:val="26"/>
         </w:rPr>
         <w:drawing>
-          <wp:inline distT="0" distB="0" distL="0" distR="0">
+          <wp:inline distT="0" distB="0" distL="0" distR="0" wp14:anchorId="58D638EB" wp14:editId="2D527CFE">
             <wp:extent cx="5943600" cy="4821555"/>
             <wp:effectExtent l="0" t="0" r="0" b="0"/>
             <wp:docPr id="4" name="Picture 4"/>
@@ -1524,7 +1524,14 @@
                 <w:sz w:val="26"/>
                 <w:szCs w:val="26"/>
               </w:rPr>
-              <w:t>Người dùng phổ thông chưa đăng nhập vào tài khoản cá nhân.</w:t>
+              <w:t xml:space="preserve">Người dùng phổ thông </w:t>
+            </w:r>
+            <w:r>
+              <w:rPr>
+                <w:sz w:val="26"/>
+                <w:szCs w:val="26"/>
+              </w:rPr>
+              <w:t>truy cập vào web bằng link hoặc quét QR</w:t>
             </w:r>
           </w:p>
         </w:tc>
@@ -2480,7 +2487,6 @@
                 <w:sz w:val="26"/>
                 <w:szCs w:val="26"/>
               </w:rPr>
-              <w:lastRenderedPageBreak/>
               <w:t>Điều kiện kết thúc:</w:t>
             </w:r>
           </w:p>
@@ -2492,6 +2498,8 @@
           <w:p>
             <w:r>
               <w:t>Thành công: Phiên làm việc (Session/Token) được khởi tạo thành công với quyền hạn tương ứng (Admin truy cập Dashboard Quản trị hệ thống; khách tham quan sử dụng trực tiếp không cần tài khoản).</w:t>
+            </w:r>
+            <w:r>
               <w:br/>
               <w:t>Thất bại: Hệ thống từ chối quyền truy cập, hiển thị thông báo lỗi (E1) và không tạo phiên làm việc.</w:t>
             </w:r>
@@ -2519,6 +2527,7 @@
                 <w:sz w:val="26"/>
                 <w:szCs w:val="26"/>
               </w:rPr>
+              <w:lastRenderedPageBreak/>
               <w:t>Sự kiện kích hoạt (Trigger):</w:t>
             </w:r>
           </w:p>
@@ -3374,7 +3383,16 @@
                       <w:sz w:val="22"/>
                       <w:szCs w:val="22"/>
                     </w:rPr>
-                    <w:t>7. Hệ thống tự động chuyển đến màn hình chi tiết hiện vật và kích hoạt chức năng liên quan (Đọc nội dung, Xem hình ảnh hoặc phát Use Case {Nghe Thuyết Minh}).</w:t>
+                    <w:t xml:space="preserve">7. Hệ thống tự động chuyển đến màn hình chi tiết hiện vật và kích hoạt chức </w:t>
+                  </w:r>
+                  <w:r>
+                    <w:rPr>
+                      <w:rFonts w:ascii="Arial" w:eastAsia="Arial" w:hAnsi="Arial" w:cs="Arial"/>
+                      <w:sz w:val="22"/>
+                      <w:szCs w:val="22"/>
+                    </w:rPr>
+                    <w:lastRenderedPageBreak/>
+                    <w:t>năng liên quan (Đọc nội dung, Xem hình ảnh hoặc phát Use Case {Nghe Thuyết Minh}).</w:t>
                   </w:r>
                 </w:p>
               </w:tc>
@@ -3391,6 +3409,7 @@
                       <w:sz w:val="22"/>
                       <w:szCs w:val="22"/>
                     </w:rPr>
+                    <w:lastRenderedPageBreak/>
                     <w:t>8. Người dùng di chuyển tham quan, không cần quét lại mã QR. (A1, A2)</w:t>
                   </w:r>
                 </w:p>
@@ -3687,25 +3706,7 @@
                 <w:sz w:val="22"/>
                 <w:szCs w:val="22"/>
               </w:rPr>
-              <w:t xml:space="preserve">E3 – Mất tín hiệu hoặc không có quyền định vị khi tracking: Hệ thống thông báo "Không thể </w:t>
-            </w:r>
-            <w:proofErr w:type="gramStart"/>
-            <w:r>
-              <w:rPr>
-                <w:rFonts w:ascii="Arial" w:eastAsia="Arial" w:hAnsi="Arial" w:cs="Arial"/>
-                <w:sz w:val="22"/>
-                <w:szCs w:val="22"/>
-              </w:rPr>
-              <w:t>theo</w:t>
-            </w:r>
-            <w:proofErr w:type="gramEnd"/>
-            <w:r>
-              <w:rPr>
-                <w:rFonts w:ascii="Arial" w:eastAsia="Arial" w:hAnsi="Arial" w:cs="Arial"/>
-                <w:sz w:val="22"/>
-                <w:szCs w:val="22"/>
-              </w:rPr>
-              <w:t xml:space="preserve"> dõi vị trí", dừng tracking tự động và đề nghị người dùng quét mã QR thủ công hoặc dùng chức năng Tìm kiếm.</w:t>
+              <w:t>E3 – Mất tín hiệu hoặc không có quyền định vị khi tracking: Hệ thống thông báo "Không thể theo dõi vị trí", dừng tracking tự động và đề nghị người dùng quét mã QR thủ công hoặc dùng chức năng Tìm kiếm.</w:t>
             </w:r>
           </w:p>
         </w:tc>
@@ -4880,23 +4881,7 @@
                 <w:sz w:val="26"/>
                 <w:szCs w:val="26"/>
               </w:rPr>
-              <w:t xml:space="preserve">A1 - Người dùng bật phụ đề (Extension Point Xem Phụ Đề): Người dùng bấm nút "Bật Phụ Đề" trên trình phát. Hệ thống kích hoạt use case Xem Phụ Đề, tải và hiển thị văn bản đồng bộ </w:t>
-            </w:r>
-            <w:proofErr w:type="gramStart"/>
-            <w:r>
-              <w:rPr>
-                <w:sz w:val="26"/>
-                <w:szCs w:val="26"/>
-              </w:rPr>
-              <w:t>theo</w:t>
-            </w:r>
-            <w:proofErr w:type="gramEnd"/>
-            <w:r>
-              <w:rPr>
-                <w:sz w:val="26"/>
-                <w:szCs w:val="26"/>
-              </w:rPr>
-              <w:t xml:space="preserve"> mốc thời gian của bài nói.</w:t>
+              <w:t>A1 - Người dùng bật phụ đề (Extension Point Xem Phụ Đề): Người dùng bấm nút "Bật Phụ Đề" trên trình phát. Hệ thống kích hoạt use case Xem Phụ Đề, tải và hiển thị văn bản đồng bộ theo mốc thời gian của bài nói.</w:t>
             </w:r>
           </w:p>
           <w:p>
@@ -6404,8 +6389,8 @@
         <w:tblLook w:val="04A0" w:firstRow="1" w:lastRow="0" w:firstColumn="1" w:lastColumn="0" w:noHBand="0" w:noVBand="1"/>
       </w:tblPr>
       <w:tblGrid>
-        <w:gridCol w:w="2170"/>
-        <w:gridCol w:w="7830"/>
+        <w:gridCol w:w="2200"/>
+        <w:gridCol w:w="7800"/>
       </w:tblGrid>
       <w:tr>
         <w:tc>
@@ -6680,12 +6665,20 @@
           <w:p>
             <w:r>
               <w:t>1. Người dùng xem chi tiết hiện vật (không yêu cầu đăng nhập).</w:t>
+            </w:r>
+            <w:r>
               <w:br/>
               <w:t>2. Hệ thống hiển thị nút "Lưu Yêu Thích" (biểu tượng trái tim).</w:t>
+            </w:r>
+            <w:r>
               <w:br/>
               <w:t>3. Người dùng bấm nút "Lưu Yêu Thích".</w:t>
+            </w:r>
+            <w:r>
               <w:br/>
               <w:t>4. Hệ thống kiểm tra: nếu chưa lưu thì thêm hiện vật vào danh sách yêu thích trên thiết bị (LocalStorage); nếu đã lưu thì hiển thị tùy chọn hủy lưu (A1).</w:t>
+            </w:r>
+            <w:r>
               <w:br/>
               <w:t>5. Hệ thống cập nhật biểu tượng trạng thái và thông báo "Đã lưu vào danh sách yêu thích".</w:t>
             </w:r>
@@ -7054,6 +7047,7 @@
         <w:spacing w:before="260" w:after="120"/>
       </w:pPr>
       <w:r>
+        <w:lastRenderedPageBreak/>
         <w:t>3.6 USC06 — Xem Hồ Sơ Bảo Tàng</w:t>
       </w:r>
     </w:p>
@@ -7778,23 +7772,7 @@
                 <w:sz w:val="26"/>
                 <w:szCs w:val="26"/>
               </w:rPr>
-              <w:t>A1 - Xem sơ đồ khu trưng bày: Tại bước 4, người dùng chọn "Sơ đồ khu trưng bày". Hệ thống hiển thị sơ đồ do Admin quản lý ở {Quản Lý Sơ Đồ}; người dùng có thể phóng to/</w:t>
-            </w:r>
-            <w:proofErr w:type="gramStart"/>
-            <w:r>
-              <w:rPr>
-                <w:sz w:val="26"/>
-                <w:szCs w:val="26"/>
-              </w:rPr>
-              <w:t>thu</w:t>
-            </w:r>
-            <w:proofErr w:type="gramEnd"/>
-            <w:r>
-              <w:rPr>
-                <w:sz w:val="26"/>
-                <w:szCs w:val="26"/>
-              </w:rPr>
-              <w:t xml:space="preserve"> nhỏ rồi quay lại bước 4.</w:t>
+              <w:t>A1 - Xem sơ đồ khu trưng bày: Tại bước 4, người dùng chọn "Sơ đồ khu trưng bày". Hệ thống hiển thị sơ đồ do Admin quản lý ở {Quản Lý Sơ Đồ}; người dùng có thể phóng to/thu nhỏ rồi quay lại bước 4.</w:t>
             </w:r>
           </w:p>
         </w:tc>
@@ -8138,7 +8116,7 @@
         <w:pStyle w:val="Heading2"/>
         <w:spacing w:before="260" w:after="120"/>
       </w:pPr>
-      <w:bookmarkStart w:id="10" w:name="_Toc243643255"/>
+      <w:bookmarkStart w:id="9" w:name="_Toc243643255"/>
       <w:r>
         <w:t>3.</w:t>
       </w:r>
@@ -8157,7 +8135,7 @@
       <w:r>
         <w:t xml:space="preserve"> — Xem Phụ Đề</w:t>
       </w:r>
-      <w:bookmarkEnd w:id="10"/>
+      <w:bookmarkEnd w:id="9"/>
     </w:p>
     <w:p>
       <w:pPr>
@@ -8867,23 +8845,7 @@
                 <w:sz w:val="26"/>
                 <w:szCs w:val="26"/>
               </w:rPr>
-              <w:t xml:space="preserve">A1 - Đổi ngôn ngữ giữa chừng: Tại bước 4, người dùng chọn {Chuyển Đổi Ngôn Ngữ}. Hệ thống tải phụ đề </w:t>
-            </w:r>
-            <w:proofErr w:type="gramStart"/>
-            <w:r>
-              <w:rPr>
-                <w:sz w:val="26"/>
-                <w:szCs w:val="26"/>
-              </w:rPr>
-              <w:t>theo</w:t>
-            </w:r>
-            <w:proofErr w:type="gramEnd"/>
-            <w:r>
-              <w:rPr>
-                <w:sz w:val="26"/>
-                <w:szCs w:val="26"/>
-              </w:rPr>
-              <w:t xml:space="preserve"> ngôn ngữ mới, đồng bộ theo vị trí phát hiện tại và tiếp tục hiển thị.</w:t>
+              <w:t>A1 - Đổi ngôn ngữ giữa chừng: Tại bước 4, người dùng chọn {Chuyển Đổi Ngôn Ngữ}. Hệ thống tải phụ đề theo ngôn ngữ mới, đồng bộ theo vị trí phát hiện tại và tiếp tục hiển thị.</w:t>
             </w:r>
           </w:p>
         </w:tc>
@@ -9206,7 +9168,7 @@
         <w:pStyle w:val="Heading2"/>
         <w:spacing w:before="260" w:after="120"/>
       </w:pPr>
-      <w:bookmarkStart w:id="11" w:name="_Toc243643256"/>
+      <w:bookmarkStart w:id="10" w:name="_Toc243643256"/>
       <w:r>
         <w:lastRenderedPageBreak/>
         <w:t>3</w:t>
@@ -9229,7 +9191,7 @@
       <w:r>
         <w:t xml:space="preserve"> — Tìm Kiếm</w:t>
       </w:r>
-      <w:bookmarkEnd w:id="11"/>
+      <w:bookmarkEnd w:id="10"/>
     </w:p>
     <w:p>
       <w:pPr>
@@ -9518,23 +9480,7 @@
                 <w:sz w:val="26"/>
                 <w:szCs w:val="26"/>
               </w:rPr>
-              <w:t xml:space="preserve">Cho phép người dùng tìm hiện vật theo tên, mã số hoặc từ khóa trong mô tả. Đây cũng là phương </w:t>
-            </w:r>
-            <w:proofErr w:type="gramStart"/>
-            <w:r>
-              <w:rPr>
-                <w:sz w:val="26"/>
-                <w:szCs w:val="26"/>
-              </w:rPr>
-              <w:t>án</w:t>
-            </w:r>
-            <w:proofErr w:type="gramEnd"/>
-            <w:r>
-              <w:rPr>
-                <w:sz w:val="26"/>
-                <w:szCs w:val="26"/>
-              </w:rPr>
-              <w:t xml:space="preserve"> thay thế khi không quét được mã QR ({Quét Mã QR} - E1, E2).</w:t>
+              <w:t>Cho phép người dùng tìm hiện vật theo tên, mã số hoặc từ khóa trong mô tả. Đây cũng là phương án thay thế khi không quét được mã QR ({Quét Mã QR} - E1, E2).</w:t>
             </w:r>
           </w:p>
         </w:tc>
@@ -10388,9 +10334,7 @@
         <w:pStyle w:val="Heading2"/>
         <w:spacing w:before="260" w:after="120"/>
       </w:pPr>
-      <w:bookmarkStart w:id="12" w:name="_Toc243643257"/>
-      <w:bookmarkStart w:id="13" w:name="_GoBack"/>
-      <w:bookmarkEnd w:id="13"/>
+      <w:bookmarkStart w:id="11" w:name="_Toc243643257"/>
       <w:r>
         <w:t>3</w:t>
       </w:r>
@@ -10409,7 +10353,7 @@
       <w:r>
         <w:t xml:space="preserve"> — Quản Lý Sự Vật</w:t>
       </w:r>
-      <w:bookmarkEnd w:id="12"/>
+      <w:bookmarkEnd w:id="11"/>
     </w:p>
     <w:p>
       <w:pPr>
@@ -11421,23 +11365,7 @@
                 <w:sz w:val="26"/>
                 <w:szCs w:val="26"/>
               </w:rPr>
-              <w:t xml:space="preserve">Ở bước 3, Admin chọn một sự vật trong danh sách và nhấn "Sửa". Hệ thống hiển thị biểu mẫu đã điền sẵn thông tin hiện tại. Các bước tiếp </w:t>
-            </w:r>
-            <w:proofErr w:type="gramStart"/>
-            <w:r>
-              <w:rPr>
-                <w:sz w:val="26"/>
-                <w:szCs w:val="26"/>
-              </w:rPr>
-              <w:t>theo</w:t>
-            </w:r>
-            <w:proofErr w:type="gramEnd"/>
-            <w:r>
-              <w:rPr>
-                <w:sz w:val="26"/>
-                <w:szCs w:val="26"/>
-              </w:rPr>
-              <w:t xml:space="preserve"> thực hiện như A1.</w:t>
+              <w:t>Ở bước 3, Admin chọn một sự vật trong danh sách và nhấn "Sửa". Hệ thống hiển thị biểu mẫu đã điền sẵn thông tin hiện tại. Các bước tiếp theo thực hiện như A1.</w:t>
             </w:r>
           </w:p>
           <w:p>
@@ -13680,7 +13608,7 @@
         </w:rPr>
         <w:lastRenderedPageBreak/>
         <w:drawing>
-          <wp:inline distT="0" distB="0" distL="0" distR="0">
+          <wp:inline distT="0" distB="0" distL="0" distR="0" wp14:anchorId="5091EC25" wp14:editId="091D3969">
             <wp:extent cx="2171700" cy="9086850"/>
             <wp:effectExtent l="0" t="0" r="0" b="0"/>
             <wp:docPr id="9" name="Picture 9"/>
@@ -13727,7 +13655,7 @@
         <w:pStyle w:val="Heading2"/>
         <w:spacing w:before="260" w:after="120"/>
       </w:pPr>
-      <w:bookmarkStart w:id="15" w:name="_Toc243643259"/>
+      <w:bookmarkStart w:id="12" w:name="_Toc243643259"/>
       <w:r>
         <w:lastRenderedPageBreak/>
         <w:t>3</w:t>
@@ -13747,7 +13675,7 @@
       <w:r>
         <w:t>— Quản Lý Tệp Âm Thanh</w:t>
       </w:r>
-      <w:bookmarkEnd w:id="15"/>
+      <w:bookmarkEnd w:id="12"/>
     </w:p>
     <w:p>
       <w:pPr>
@@ -14848,23 +14776,7 @@
                 <w:sz w:val="26"/>
                 <w:szCs w:val="26"/>
               </w:rPr>
-              <w:t xml:space="preserve">Ở bước 3, Admin chọn một tệp âm thanh đã có của hiện vật/ngôn ngữ và nhấn "Thay thế". Admin chọn file audio mới từ máy tính và bấm "Tải lên". Các bước tiếp </w:t>
-            </w:r>
-            <w:proofErr w:type="gramStart"/>
-            <w:r>
-              <w:rPr>
-                <w:sz w:val="26"/>
-                <w:szCs w:val="26"/>
-              </w:rPr>
-              <w:t>theo</w:t>
-            </w:r>
-            <w:proofErr w:type="gramEnd"/>
-            <w:r>
-              <w:rPr>
-                <w:sz w:val="26"/>
-                <w:szCs w:val="26"/>
-              </w:rPr>
-              <w:t xml:space="preserve"> thực hiện như A1; hệ thống cập nhật đường dẫn mới vào hồ sơ hiện vật và xóa tệp cũ khỏi thiết bị lưu trữ.</w:t>
+              <w:t>Ở bước 3, Admin chọn một tệp âm thanh đã có của hiện vật/ngôn ngữ và nhấn "Thay thế". Admin chọn file audio mới từ máy tính và bấm "Tải lên". Các bước tiếp theo thực hiện như A1; hệ thống cập nhật đường dẫn mới vào hồ sơ hiện vật và xóa tệp cũ khỏi thiết bị lưu trữ.</w:t>
             </w:r>
           </w:p>
           <w:p>
@@ -15058,23 +14970,7 @@
                 <w:sz w:val="26"/>
                 <w:szCs w:val="26"/>
               </w:rPr>
-              <w:t xml:space="preserve">Tệp âm thanh được lưu trữ </w:t>
-            </w:r>
-            <w:proofErr w:type="gramStart"/>
-            <w:r>
-              <w:rPr>
-                <w:sz w:val="26"/>
-                <w:szCs w:val="26"/>
-              </w:rPr>
-              <w:t>an</w:t>
-            </w:r>
-            <w:proofErr w:type="gramEnd"/>
-            <w:r>
-              <w:rPr>
-                <w:sz w:val="26"/>
-                <w:szCs w:val="26"/>
-              </w:rPr>
-              <w:t xml:space="preserve"> toàn trên thiết bị lưu trữ và liên kết đúng với hiện vật tương ứng; hoặc được thay thế/xóa khỏi thiết bị lưu trữ và hồ sơ hiện vật nếu Admin chọn thay thế/xóa.</w:t>
+              <w:t>Tệp âm thanh được lưu trữ an toàn trên thiết bị lưu trữ và liên kết đúng với hiện vật tương ứng; hoặc được thay thế/xóa khỏi thiết bị lưu trữ và hồ sơ hiện vật nếu Admin chọn thay thế/xóa.</w:t>
             </w:r>
           </w:p>
         </w:tc>
@@ -15147,7 +15043,7 @@
         </w:rPr>
         <w:lastRenderedPageBreak/>
         <w:drawing>
-          <wp:inline distT="0" distB="0" distL="0" distR="0">
+          <wp:inline distT="0" distB="0" distL="0" distR="0" wp14:anchorId="41302F2F" wp14:editId="708F0732">
             <wp:extent cx="2384425" cy="7209692"/>
             <wp:effectExtent l="0" t="0" r="0" b="0"/>
             <wp:docPr id="1" name="Picture 1"/>
@@ -15208,7 +15104,7 @@
         <w:pStyle w:val="Heading2"/>
         <w:spacing w:before="260" w:after="120"/>
       </w:pPr>
-      <w:bookmarkStart w:id="16" w:name="_Toc243643260"/>
+      <w:bookmarkStart w:id="13" w:name="_Toc243643260"/>
       <w:r>
         <w:lastRenderedPageBreak/>
         <w:t>3</w:t>
@@ -15228,7 +15124,7 @@
       <w:r>
         <w:t xml:space="preserve"> — Xem Thống Kê Lượt Nghe</w:t>
       </w:r>
-      <w:bookmarkEnd w:id="16"/>
+      <w:bookmarkEnd w:id="13"/>
     </w:p>
     <w:p>
       <w:pPr>
@@ -16384,23 +16280,7 @@
                 <w:sz w:val="26"/>
                 <w:szCs w:val="26"/>
               </w:rPr>
-              <w:t xml:space="preserve">Ở bước 6, Admin bấm "Xuất báo cáo" và chọn định dạng Excel hoặc PDF. Hệ thống đóng gói dữ liệu báo cáo (E3) và tải về máy </w:t>
-            </w:r>
-            <w:proofErr w:type="gramStart"/>
-            <w:r>
-              <w:rPr>
-                <w:sz w:val="26"/>
-                <w:szCs w:val="26"/>
-              </w:rPr>
-              <w:t>theo</w:t>
-            </w:r>
-            <w:proofErr w:type="gramEnd"/>
-            <w:r>
-              <w:rPr>
-                <w:sz w:val="26"/>
-                <w:szCs w:val="26"/>
-              </w:rPr>
-              <w:t xml:space="preserve"> định dạng đã chọn. Use case kết thúc.</w:t>
+              <w:t>Ở bước 6, Admin bấm "Xuất báo cáo" và chọn định dạng Excel hoặc PDF. Hệ thống đóng gói dữ liệu báo cáo (E3) và tải về máy theo định dạng đã chọn. Use case kết thúc.</w:t>
             </w:r>
           </w:p>
         </w:tc>
@@ -16707,7 +16587,7 @@
         <w:pStyle w:val="Heading2"/>
         <w:spacing w:before="260" w:after="120"/>
       </w:pPr>
-      <w:bookmarkStart w:id="17" w:name="_Toc243643261"/>
+      <w:bookmarkStart w:id="14" w:name="_Toc243643261"/>
       <w:r>
         <w:lastRenderedPageBreak/>
         <w:t>3</w:t>
@@ -16727,7 +16607,7 @@
       <w:r>
         <w:t xml:space="preserve"> — Quản Lý Sơ Đồ</w:t>
       </w:r>
-      <w:bookmarkEnd w:id="17"/>
+      <w:bookmarkEnd w:id="14"/>
     </w:p>
     <w:p>
       <w:pPr>
@@ -17731,23 +17611,7 @@
                 <w:sz w:val="26"/>
                 <w:szCs w:val="26"/>
               </w:rPr>
-              <w:t xml:space="preserve">Ở bước 3, Admin chọn "Thêm sơ đồ mới" và tải lên ảnh mặt bằng cho tầng/khu vực. Hệ thống kiểm tra định dạng và dung lượng ảnh (E1), sau đó hiển thị giao diện biên tập sơ đồ tương tác. Các bước tiếp </w:t>
-            </w:r>
-            <w:proofErr w:type="gramStart"/>
-            <w:r>
-              <w:rPr>
-                <w:sz w:val="26"/>
-                <w:szCs w:val="26"/>
-              </w:rPr>
-              <w:t>theo</w:t>
-            </w:r>
-            <w:proofErr w:type="gramEnd"/>
-            <w:r>
-              <w:rPr>
-                <w:sz w:val="26"/>
-                <w:szCs w:val="26"/>
-              </w:rPr>
-              <w:t xml:space="preserve"> thực hiện như A2.</w:t>
+              <w:t>Ở bước 3, Admin chọn "Thêm sơ đồ mới" và tải lên ảnh mặt bằng cho tầng/khu vực. Hệ thống kiểm tra định dạng và dung lượng ảnh (E1), sau đó hiển thị giao diện biên tập sơ đồ tương tác. Các bước tiếp theo thực hiện như A2.</w:t>
             </w:r>
           </w:p>
           <w:p>
@@ -18109,6 +17973,7 @@
         <w:spacing w:before="260" w:after="120"/>
       </w:pPr>
       <w:r>
+        <w:lastRenderedPageBreak/>
         <w:t>3.14 USC14 — Định Vị Vị Trí &amp; Tự Động Thuyết Minh</w:t>
       </w:r>
     </w:p>
@@ -18173,7 +18038,7 @@
           <w:szCs w:val="26"/>
         </w:rPr>
         <w:drawing>
-          <wp:inline distT="0" distB="0" distL="0" distR="0">
+          <wp:inline distT="0" distB="0" distL="0" distR="0" wp14:anchorId="3A14034C" wp14:editId="2CCF5772">
             <wp:extent cx="5224892" cy="1228725"/>
             <wp:effectExtent l="0" t="0" r="0" b="0"/>
             <wp:docPr id="10" name="Picture 10"/>
@@ -18547,25 +18412,7 @@
                 <w:sz w:val="22"/>
                 <w:szCs w:val="22"/>
               </w:rPr>
-              <w:t xml:space="preserve">Ứng dụng được cấp quyền định vị/kết nối cần thiết (vị trí, Bluetooth hoặc Wi-Fi tùy phương </w:t>
-            </w:r>
-            <w:proofErr w:type="gramStart"/>
-            <w:r>
-              <w:rPr>
-                <w:rFonts w:ascii="Arial" w:eastAsia="Arial" w:hAnsi="Arial" w:cs="Arial"/>
-                <w:sz w:val="22"/>
-                <w:szCs w:val="22"/>
-              </w:rPr>
-              <w:t>án</w:t>
-            </w:r>
-            <w:proofErr w:type="gramEnd"/>
-            <w:r>
-              <w:rPr>
-                <w:rFonts w:ascii="Arial" w:eastAsia="Arial" w:hAnsi="Arial" w:cs="Arial"/>
-                <w:sz w:val="22"/>
-                <w:szCs w:val="22"/>
-              </w:rPr>
-              <w:t xml:space="preserve"> triển khai).</w:t>
+              <w:t>Ứng dụng được cấp quyền định vị/kết nối cần thiết (vị trí, Bluetooth hoặc Wi-Fi tùy phương án triển khai).</w:t>
             </w:r>
           </w:p>
           <w:p>
@@ -19687,29 +19534,7 @@
                 <w:sz w:val="22"/>
                 <w:szCs w:val="22"/>
               </w:rPr>
-              <w:t xml:space="preserve">A4 – Dừng </w:t>
-            </w:r>
-            <w:proofErr w:type="gramStart"/>
-            <w:r>
-              <w:rPr>
-                <w:rFonts w:ascii="Arial" w:eastAsia="Arial" w:hAnsi="Arial" w:cs="Arial"/>
-                <w:b/>
-                <w:bCs/>
-                <w:sz w:val="22"/>
-                <w:szCs w:val="22"/>
-              </w:rPr>
-              <w:t>theo</w:t>
-            </w:r>
-            <w:proofErr w:type="gramEnd"/>
-            <w:r>
-              <w:rPr>
-                <w:rFonts w:ascii="Arial" w:eastAsia="Arial" w:hAnsi="Arial" w:cs="Arial"/>
-                <w:b/>
-                <w:bCs/>
-                <w:sz w:val="22"/>
-                <w:szCs w:val="22"/>
-              </w:rPr>
-              <w:t xml:space="preserve"> dõi:</w:t>
+              <w:t>A4 – Dừng theo dõi:</w:t>
             </w:r>
             <w:r>
               <w:rPr>
@@ -19797,25 +19622,7 @@
                 <w:sz w:val="22"/>
                 <w:szCs w:val="22"/>
               </w:rPr>
-              <w:t xml:space="preserve"> Hệ thống thông báo “Không thể </w:t>
-            </w:r>
-            <w:proofErr w:type="gramStart"/>
-            <w:r>
-              <w:rPr>
-                <w:rFonts w:ascii="Arial" w:eastAsia="Arial" w:hAnsi="Arial" w:cs="Arial"/>
-                <w:sz w:val="22"/>
-                <w:szCs w:val="22"/>
-              </w:rPr>
-              <w:t>theo</w:t>
-            </w:r>
-            <w:proofErr w:type="gramEnd"/>
-            <w:r>
-              <w:rPr>
-                <w:rFonts w:ascii="Arial" w:eastAsia="Arial" w:hAnsi="Arial" w:cs="Arial"/>
-                <w:sz w:val="22"/>
-                <w:szCs w:val="22"/>
-              </w:rPr>
-              <w:t xml:space="preserve"> dõi vị trí”, dừng tracking tự động và đề nghị người dùng quét mã QR thủ công hoặc dùng chức năng Tìm Kiếm (USC02 – E3).</w:t>
+              <w:t xml:space="preserve"> Hệ thống thông báo “Không thể theo dõi vị trí”, dừng tracking tự động và đề nghị người dùng quét mã QR thủ công hoặc dùng chức năng Tìm Kiếm (USC02 – E3).</w:t>
             </w:r>
           </w:p>
           <w:p>
@@ -20078,7 +19885,7 @@
         </w:rPr>
         <w:lastRenderedPageBreak/>
         <w:drawing>
-          <wp:inline distT="0" distB="0" distL="0" distR="0">
+          <wp:inline distT="0" distB="0" distL="0" distR="0" wp14:anchorId="295A8C47" wp14:editId="11C44DCC">
             <wp:extent cx="3009900" cy="8657770"/>
             <wp:effectExtent l="0" t="0" r="0" b="0"/>
             <wp:docPr id="11" name="Picture 11"/>
@@ -20134,7 +19941,6 @@
           <w:szCs w:val="26"/>
         </w:rPr>
       </w:pPr>
-      <w:r/>
     </w:p>
     <w:p>
       <w:pPr>
@@ -20145,14 +19951,48 @@
       </w:r>
     </w:p>
     <w:p>
+      <w:pPr>
+        <w:rPr>
+          <w:sz w:val="26"/>
+          <w:szCs w:val="26"/>
+        </w:rPr>
+      </w:pPr>
       <w:r>
+        <w:rPr>
+          <w:sz w:val="26"/>
+          <w:szCs w:val="26"/>
+        </w:rPr>
         <w:t>Sơ đồ thành phần mô tả cấu trúc hệ thống theo kiến trúc SPA Front-end hiện đại và các dịch vụ ngoại vi:</w:t>
+      </w:r>
+      <w:r>
+        <w:rPr>
+          <w:sz w:val="26"/>
+          <w:szCs w:val="26"/>
+        </w:rPr>
         <w:br/>
         <w:t>1. Phân hệ Khách Tham Quan (Visitor App): Gồm VisitorLayout (Router QR &amp; GPS), TrackingPanel (theo dõi vị trí &amp; đề xuất chuyển/nghe lại), AudioPlayer &amp; Subtitles (phát audio &amp; phụ đề karaoke từng giây), FloorMapView (bản đồ tương tác đa tầng &amp; halo vị trí "Bạn đang ở đây"), ExploreView (tìm kiếm theo tên, mã số ART-xxx, mô tả), ArtifactDetailView (nội dung chi tiết hiện vật).</w:t>
+      </w:r>
+      <w:r>
+        <w:rPr>
+          <w:sz w:val="26"/>
+          <w:szCs w:val="26"/>
+        </w:rPr>
         <w:br/>
         <w:t>2. Phân hệ Quản Trị (Admin App): Gồm AdminLoginView (bảo mật khóa tạm thời 5 phút khi nhập sai quá 5 lần liên tiếp), AdminDashboard (thống kê lượt nghe theo phiên và hiện vật), ArtifactsManageView (CRUD hiện vật, cấu hình tọa độ GPS vĩ độ/kinh độ &amp; bán kính kích hoạt triggerRadius), SessionsManageView (quản lý phiên tham quan &amp; xuất mã QR đón tiếp tại cổng).</w:t>
+      </w:r>
+      <w:r>
+        <w:rPr>
+          <w:sz w:val="26"/>
+          <w:szCs w:val="26"/>
+        </w:rPr>
         <w:br/>
         <w:t>3. Khối Core Modules &amp; Shared Services: geofence.ts (tính khoảng cách Haversine &amp; vùng kích hoạt), qrHelper.ts (giải mã QR &amp; deep link), loginLock.ts (động cơ bảo mật lockout), các Zustand stores (geofenceStore, audioStore, favoritesStore, languageStore, sessionStore) và api.ts (mock data &amp; lưu trữ LocalStorage bền vững).</w:t>
+      </w:r>
+      <w:r>
+        <w:rPr>
+          <w:sz w:val="26"/>
+          <w:szCs w:val="26"/>
+        </w:rPr>
         <w:br/>
         <w:t>4. Hạ tầng Lưu trữ &amp; Dịch vụ: GitHub Pages (lưu trữ mã nguồn tĩnh HTML/JS/CSS, âm thanh MP3 và hình ảnh sơ đồ) kết hợp dịch vụ ntfy.sh phục vụ giám sát và telemetry thời gian thực.</w:t>
       </w:r>
@@ -20166,12 +20006,40 @@
       </w:r>
     </w:p>
     <w:p>
+      <w:pPr>
+        <w:rPr>
+          <w:sz w:val="26"/>
+          <w:szCs w:val="26"/>
+        </w:rPr>
+      </w:pPr>
       <w:r>
+        <w:rPr>
+          <w:sz w:val="26"/>
+          <w:szCs w:val="26"/>
+        </w:rPr>
         <w:t>Sơ đồ triển khai xác định môi trường thực thi và hạ tầng mạng của hệ thống:</w:t>
+      </w:r>
+      <w:r>
+        <w:rPr>
+          <w:sz w:val="26"/>
+          <w:szCs w:val="26"/>
+        </w:rPr>
         <w:br/>
         <w:t>1. Nút Thiết bị Người dùng (Client Device - Mobile / Desktop): Chạy trên trình duyệt Web hiện đại (Chrome, Safari, Edge, Firefox), tận dụng trực tiếp các Web API chuẩn mực: HTML5 Web Audio API (phát luồng âm thanh), HTML5 Geolocation API (định vị GPS độ chính xác cao), HTML5 MediaDevices / Camera API (quét mã QR trực tiếp qua camera), và Browser LocalStorage (lưu hiện vật yêu thích, token và cài đặt người dùng mà không cần cài đặt ứng dụng).</w:t>
+      </w:r>
+      <w:r>
+        <w:rPr>
+          <w:sz w:val="26"/>
+          <w:szCs w:val="26"/>
+        </w:rPr>
         <w:br/>
         <w:t>2. Nút Hạ tầng GitHub Pages (Nginx CDN HTTPS :443): Đóng gói bản dựng Vite SPA, tệp chỉ mục index.html, các tài sản âm thanh public/audio/*.mp3 và hình ảnh sơ đồ public/images/*.png, phân phối toàn cầu với độ trễ thấp và bảo mật SSL/TLS.</w:t>
+      </w:r>
+      <w:r>
+        <w:rPr>
+          <w:sz w:val="26"/>
+          <w:szCs w:val="26"/>
+        </w:rPr>
         <w:br/>
         <w:t>3. Nút Hạ tầng Giám Sát / Analytics (ntfy.sh HTTPS Gateway): Tiếp nhận các sự kiện thống kê, lượt nghe và phiên tham quan qua giao thức HTTPS POST.</w:t>
       </w:r>
@@ -20187,8 +20055,8 @@
 </file>
 
 <file path=word/numbering.xml><?xml version="1.0" encoding="utf-8"?>
-<w:numbering xmlns:wpc="http://schemas.microsoft.com/office/word/2010/wordprocessingCanvas" xmlns:mc="http://schemas.openxmlformats.org/markup-compatibility/2006" xmlns:o="urn:schemas-microsoft-com:office:office" xmlns:r="http://schemas.openxmlformats.org/officeDocument/2006/relationships" xmlns:m="http://schemas.openxmlformats.org/officeDocument/2006/math" xmlns:v="urn:schemas-microsoft-com:vml" xmlns:wp14="http://schemas.microsoft.com/office/word/2010/wordprocessingDrawing" xmlns:wp="http://schemas.openxmlformats.org/drawingml/2006/wordprocessingDrawing" xmlns:w10="urn:schemas-microsoft-com:office:word" xmlns:w="http://schemas.openxmlformats.org/wordprocessingml/2006/main" xmlns:w14="http://schemas.microsoft.com/office/word/2010/wordml" xmlns:w15="http://schemas.microsoft.com/office/word/2012/wordml" xmlns:wpg="http://schemas.microsoft.com/office/word/2010/wordprocessingGroup" xmlns:wpi="http://schemas.microsoft.com/office/word/2010/wordprocessingInk" xmlns:wne="http://schemas.microsoft.com/office/word/2006/wordml" xmlns:wps="http://schemas.microsoft.com/office/word/2010/wordprocessingShape" mc:Ignorable="w14 w15 wp14">
-  <w:abstractNum w:abstractNumId="0">
+<w:numbering xmlns:wpc="http://schemas.microsoft.com/office/word/2010/wordprocessingCanvas" xmlns:cx="http://schemas.microsoft.com/office/drawing/2014/chartex" xmlns:cx1="http://schemas.microsoft.com/office/drawing/2015/9/8/chartex" xmlns:cx2="http://schemas.microsoft.com/office/drawing/2015/10/21/chartex" xmlns:cx3="http://schemas.microsoft.com/office/drawing/2016/5/9/chartex" xmlns:cx4="http://schemas.microsoft.com/office/drawing/2016/5/10/chartex" xmlns:cx5="http://schemas.microsoft.com/office/drawing/2016/5/11/chartex" xmlns:cx6="http://schemas.microsoft.com/office/drawing/2016/5/12/chartex" xmlns:cx7="http://schemas.microsoft.com/office/drawing/2016/5/13/chartex" xmlns:cx8="http://schemas.microsoft.com/office/drawing/2016/5/14/chartex" xmlns:mc="http://schemas.openxmlformats.org/markup-compatibility/2006" xmlns:aink="http://schemas.microsoft.com/office/drawing/2016/ink" xmlns:am3d="http://schemas.microsoft.com/office/drawing/2017/model3d" xmlns:o="urn:schemas-microsoft-com:office:office" xmlns:oel="http://schemas.microsoft.com/office/2019/extlst" xmlns:r="http://schemas.openxmlformats.org/officeDocument/2006/relationships" xmlns:m="http://schemas.openxmlformats.org/officeDocument/2006/math" xmlns:v="urn:schemas-microsoft-com:vml" xmlns:wp14="http://schemas.microsoft.com/office/word/2010/wordprocessingDrawing" xmlns:wp="http://schemas.openxmlformats.org/drawingml/2006/wordprocessingDrawing" xmlns:w10="urn:schemas-microsoft-com:office:word" xmlns:w="http://schemas.openxmlformats.org/wordprocessingml/2006/main" xmlns:w14="http://schemas.microsoft.com/office/word/2010/wordml" xmlns:w15="http://schemas.microsoft.com/office/word/2012/wordml" xmlns:w16cex="http://schemas.microsoft.com/office/word/2018/wordml/cex" xmlns:w16cid="http://schemas.microsoft.com/office/word/2016/wordml/cid" xmlns:w16="http://schemas.microsoft.com/office/word/2018/wordml" xmlns:w16du="http://schemas.microsoft.com/office/word/2023/wordml/word16du" xmlns:w16sdtdh="http://schemas.microsoft.com/office/word/2020/wordml/sdtdatahash" xmlns:w16sdtfl="http://schemas.microsoft.com/office/word/2024/wordml/sdtformatlock" xmlns:w16se="http://schemas.microsoft.com/office/word/2015/wordml/symex" xmlns:wpg="http://schemas.microsoft.com/office/word/2010/wordprocessingGroup" xmlns:wpi="http://schemas.microsoft.com/office/word/2010/wordprocessingInk" xmlns:wne="http://schemas.microsoft.com/office/word/2006/wordml" xmlns:wps="http://schemas.microsoft.com/office/word/2010/wordprocessingShape" mc:Ignorable="w14 w15 w16se w16cid w16 w16cex w16sdtdh w16sdtfl w16du wp14">
+  <w:abstractNum w:abstractNumId="0" w15:restartNumberingAfterBreak="0">
     <w:nsid w:val="2BFB753D"/>
     <w:multiLevelType w:val="hybridMultilevel"/>
     <w:tmpl w:val="D5EA0D58"/>
@@ -20242,7 +20110,7 @@
       <w:lvlJc w:val="left"/>
     </w:lvl>
   </w:abstractNum>
-  <w:abstractNum w:abstractNumId="1">
+  <w:abstractNum w:abstractNumId="1" w15:restartNumberingAfterBreak="0">
     <w:nsid w:val="30211DFF"/>
     <w:multiLevelType w:val="hybridMultilevel"/>
     <w:tmpl w:val="EFF2AFCA"/>
@@ -20296,7 +20164,7 @@
       <w:lvlJc w:val="left"/>
     </w:lvl>
   </w:abstractNum>
-  <w:abstractNum w:abstractNumId="2">
+  <w:abstractNum w:abstractNumId="2" w15:restartNumberingAfterBreak="0">
     <w:nsid w:val="40E12CB7"/>
     <w:multiLevelType w:val="hybridMultilevel"/>
     <w:tmpl w:val="3EAA6A1C"/>
@@ -20350,7 +20218,7 @@
       <w:lvlJc w:val="left"/>
     </w:lvl>
   </w:abstractNum>
-  <w:abstractNum w:abstractNumId="3">
+  <w:abstractNum w:abstractNumId="3" w15:restartNumberingAfterBreak="0">
     <w:nsid w:val="46FA1D91"/>
     <w:multiLevelType w:val="hybridMultilevel"/>
     <w:tmpl w:val="F1503770"/>
@@ -20404,7 +20272,7 @@
       <w:lvlJc w:val="left"/>
     </w:lvl>
   </w:abstractNum>
-  <w:abstractNum w:abstractNumId="4">
+  <w:abstractNum w:abstractNumId="4" w15:restartNumberingAfterBreak="0">
     <w:nsid w:val="493E1842"/>
     <w:multiLevelType w:val="hybridMultilevel"/>
     <w:tmpl w:val="A25669FA"/>
@@ -20490,7 +20358,7 @@
       </w:pPr>
     </w:lvl>
   </w:abstractNum>
-  <w:abstractNum w:abstractNumId="5">
+  <w:abstractNum w:abstractNumId="5" w15:restartNumberingAfterBreak="0">
     <w:nsid w:val="495F03AE"/>
     <w:multiLevelType w:val="hybridMultilevel"/>
     <w:tmpl w:val="8CF62478"/>
@@ -20544,7 +20412,7 @@
       <w:lvlJc w:val="left"/>
     </w:lvl>
   </w:abstractNum>
-  <w:abstractNum w:abstractNumId="6">
+  <w:abstractNum w:abstractNumId="6" w15:restartNumberingAfterBreak="0">
     <w:nsid w:val="49E35506"/>
     <w:multiLevelType w:val="hybridMultilevel"/>
     <w:tmpl w:val="B510A7E6"/>
@@ -20633,7 +20501,7 @@
       </w:pPr>
     </w:lvl>
   </w:abstractNum>
-  <w:abstractNum w:abstractNumId="7">
+  <w:abstractNum w:abstractNumId="7" w15:restartNumberingAfterBreak="0">
     <w:nsid w:val="4EC65277"/>
     <w:multiLevelType w:val="hybridMultilevel"/>
     <w:tmpl w:val="B26A2D84"/>
@@ -20687,7 +20555,7 @@
       <w:lvlJc w:val="left"/>
     </w:lvl>
   </w:abstractNum>
-  <w:abstractNum w:abstractNumId="8">
+  <w:abstractNum w:abstractNumId="8" w15:restartNumberingAfterBreak="0">
     <w:nsid w:val="587F4B13"/>
     <w:multiLevelType w:val="hybridMultilevel"/>
     <w:tmpl w:val="C36EEB6E"/>
@@ -20741,7 +20609,7 @@
       <w:lvlJc w:val="left"/>
     </w:lvl>
   </w:abstractNum>
-  <w:abstractNum w:abstractNumId="9">
+  <w:abstractNum w:abstractNumId="9" w15:restartNumberingAfterBreak="0">
     <w:nsid w:val="617E6441"/>
     <w:multiLevelType w:val="hybridMultilevel"/>
     <w:tmpl w:val="ACACD6B2"/>
@@ -20795,7 +20663,7 @@
       <w:lvlJc w:val="left"/>
     </w:lvl>
   </w:abstractNum>
-  <w:abstractNum w:abstractNumId="10">
+  <w:abstractNum w:abstractNumId="10" w15:restartNumberingAfterBreak="0">
     <w:nsid w:val="646843F5"/>
     <w:multiLevelType w:val="hybridMultilevel"/>
     <w:tmpl w:val="BA6A054C"/>
@@ -20881,7 +20749,7 @@
       </w:pPr>
     </w:lvl>
   </w:abstractNum>
-  <w:abstractNum w:abstractNumId="11">
+  <w:abstractNum w:abstractNumId="11" w15:restartNumberingAfterBreak="0">
     <w:nsid w:val="66F1028D"/>
     <w:multiLevelType w:val="hybridMultilevel"/>
     <w:tmpl w:val="009A61F2"/>
@@ -20935,7 +20803,7 @@
       <w:lvlJc w:val="left"/>
     </w:lvl>
   </w:abstractNum>
-  <w:abstractNum w:abstractNumId="12">
+  <w:abstractNum w:abstractNumId="12" w15:restartNumberingAfterBreak="0">
     <w:nsid w:val="6C1F2DBB"/>
     <w:multiLevelType w:val="hybridMultilevel"/>
     <w:tmpl w:val="16B8019C"/>
@@ -20989,7 +20857,7 @@
       <w:lvlJc w:val="left"/>
     </w:lvl>
   </w:abstractNum>
-  <w:abstractNum w:abstractNumId="13">
+  <w:abstractNum w:abstractNumId="13" w15:restartNumberingAfterBreak="0">
     <w:nsid w:val="6C641691"/>
     <w:multiLevelType w:val="hybridMultilevel"/>
     <w:tmpl w:val="C6DA471A"/>
@@ -21043,7 +20911,7 @@
       <w:lvlJc w:val="left"/>
     </w:lvl>
   </w:abstractNum>
-  <w:abstractNum w:abstractNumId="14">
+  <w:abstractNum w:abstractNumId="14" w15:restartNumberingAfterBreak="0">
     <w:nsid w:val="72F27AD6"/>
     <w:multiLevelType w:val="hybridMultilevel"/>
     <w:tmpl w:val="86248D04"/>
@@ -21097,94 +20965,94 @@
       <w:lvlJc w:val="left"/>
     </w:lvl>
   </w:abstractNum>
-  <w:num w:numId="1">
+  <w:num w:numId="1" w16cid:durableId="794176470">
     <w:abstractNumId w:val="4"/>
     <w:lvlOverride w:ilvl="0">
       <w:startOverride w:val="1"/>
     </w:lvlOverride>
   </w:num>
-  <w:num w:numId="2">
+  <w:num w:numId="2" w16cid:durableId="556624006">
     <w:abstractNumId w:val="6"/>
   </w:num>
-  <w:num w:numId="3">
+  <w:num w:numId="3" w16cid:durableId="1544826753">
     <w:abstractNumId w:val="3"/>
     <w:lvlOverride w:ilvl="0">
       <w:startOverride w:val="1"/>
     </w:lvlOverride>
   </w:num>
-  <w:num w:numId="4">
+  <w:num w:numId="4" w16cid:durableId="138156907">
     <w:abstractNumId w:val="1"/>
     <w:lvlOverride w:ilvl="0">
       <w:startOverride w:val="1"/>
     </w:lvlOverride>
   </w:num>
-  <w:num w:numId="5">
+  <w:num w:numId="5" w16cid:durableId="290523034">
     <w:abstractNumId w:val="11"/>
     <w:lvlOverride w:ilvl="0">
       <w:startOverride w:val="1"/>
     </w:lvlOverride>
   </w:num>
-  <w:num w:numId="6">
+  <w:num w:numId="6" w16cid:durableId="198399485">
     <w:abstractNumId w:val="9"/>
     <w:lvlOverride w:ilvl="0">
       <w:startOverride w:val="1"/>
     </w:lvlOverride>
   </w:num>
-  <w:num w:numId="7">
+  <w:num w:numId="7" w16cid:durableId="76178218">
     <w:abstractNumId w:val="5"/>
     <w:lvlOverride w:ilvl="0">
       <w:startOverride w:val="1"/>
     </w:lvlOverride>
   </w:num>
-  <w:num w:numId="8">
+  <w:num w:numId="8" w16cid:durableId="728384511">
     <w:abstractNumId w:val="12"/>
     <w:lvlOverride w:ilvl="0">
       <w:startOverride w:val="1"/>
     </w:lvlOverride>
   </w:num>
-  <w:num w:numId="9">
+  <w:num w:numId="9" w16cid:durableId="1106197024">
     <w:abstractNumId w:val="14"/>
     <w:lvlOverride w:ilvl="0">
       <w:startOverride w:val="1"/>
     </w:lvlOverride>
   </w:num>
-  <w:num w:numId="10">
+  <w:num w:numId="10" w16cid:durableId="130682978">
     <w:abstractNumId w:val="7"/>
     <w:lvlOverride w:ilvl="0">
       <w:startOverride w:val="1"/>
     </w:lvlOverride>
   </w:num>
-  <w:num w:numId="11">
+  <w:num w:numId="11" w16cid:durableId="4794005">
     <w:abstractNumId w:val="0"/>
     <w:lvlOverride w:ilvl="0">
       <w:startOverride w:val="1"/>
     </w:lvlOverride>
   </w:num>
-  <w:num w:numId="12">
+  <w:num w:numId="12" w16cid:durableId="1203590402">
     <w:abstractNumId w:val="10"/>
     <w:lvlOverride w:ilvl="0">
       <w:startOverride w:val="1"/>
     </w:lvlOverride>
   </w:num>
-  <w:num w:numId="13">
+  <w:num w:numId="13" w16cid:durableId="1210343215">
     <w:abstractNumId w:val="13"/>
   </w:num>
-  <w:num w:numId="14">
+  <w:num w:numId="14" w16cid:durableId="1454251593">
     <w:abstractNumId w:val="13"/>
   </w:num>
-  <w:num w:numId="15">
+  <w:num w:numId="15" w16cid:durableId="1057439265">
     <w:abstractNumId w:val="13"/>
     <w:lvlOverride w:ilvl="0">
       <w:startOverride w:val="1"/>
     </w:lvlOverride>
   </w:num>
-  <w:num w:numId="16">
+  <w:num w:numId="16" w16cid:durableId="2006518908">
     <w:abstractNumId w:val="8"/>
     <w:lvlOverride w:ilvl="0">
       <w:startOverride w:val="1"/>
     </w:lvlOverride>
   </w:num>
-  <w:num w:numId="17">
+  <w:num w:numId="17" w16cid:durableId="1549030791">
     <w:abstractNumId w:val="2"/>
     <w:lvlOverride w:ilvl="0">
       <w:startOverride w:val="1"/>
@@ -21194,7 +21062,7 @@
 </file>
 
 <file path=word/styles.xml><?xml version="1.0" encoding="utf-8"?>
-<w:styles xmlns:mc="http://schemas.openxmlformats.org/markup-compatibility/2006" xmlns:r="http://schemas.openxmlformats.org/officeDocument/2006/relationships" xmlns:w="http://schemas.openxmlformats.org/wordprocessingml/2006/main" xmlns:w14="http://schemas.microsoft.com/office/word/2010/wordml" xmlns:w15="http://schemas.microsoft.com/office/word/2012/wordml" mc:Ignorable="w14 w15">
+<w:styles xmlns:mc="http://schemas.openxmlformats.org/markup-compatibility/2006" xmlns:r="http://schemas.openxmlformats.org/officeDocument/2006/relationships" xmlns:w="http://schemas.openxmlformats.org/wordprocessingml/2006/main" xmlns:w14="http://schemas.microsoft.com/office/word/2010/wordml" xmlns:w15="http://schemas.microsoft.com/office/word/2012/wordml" xmlns:w16cex="http://schemas.microsoft.com/office/word/2018/wordml/cex" xmlns:w16cid="http://schemas.microsoft.com/office/word/2016/wordml/cid" xmlns:w16="http://schemas.microsoft.com/office/word/2018/wordml" xmlns:w16du="http://schemas.microsoft.com/office/word/2023/wordml/word16du" xmlns:w16sdtdh="http://schemas.microsoft.com/office/word/2020/wordml/sdtdatahash" xmlns:w16sdtfl="http://schemas.microsoft.com/office/word/2024/wordml/sdtformatlock" xmlns:w16se="http://schemas.microsoft.com/office/word/2015/wordml/symex" mc:Ignorable="w14 w15 w16se w16cid w16 w16cex w16sdtdh w16sdtfl w16du">
   <w:docDefaults>
     <w:rPrDefault>
       <w:rPr>
@@ -21204,7 +21072,7 @@
     </w:rPrDefault>
     <w:pPrDefault/>
   </w:docDefaults>
-  <w:latentStyles w:defLockedState="0" w:defUIPriority="99" w:defSemiHidden="0" w:defUnhideWhenUsed="0" w:defQFormat="0" w:count="371">
+  <w:latentStyles w:defLockedState="0" w:defUIPriority="99" w:defSemiHidden="0" w:defUnhideWhenUsed="0" w:defQFormat="0" w:count="376">
     <w:lsdException w:name="Normal" w:uiPriority="0" w:qFormat="1"/>
     <w:lsdException w:name="heading 1" w:uiPriority="9" w:qFormat="1"/>
     <w:lsdException w:name="heading 2" w:semiHidden="1" w:uiPriority="0" w:unhideWhenUsed="1" w:qFormat="1"/>
@@ -21576,6 +21444,11 @@
     <w:lsdException w:name="List Table 5 Dark Accent 6" w:uiPriority="50"/>
     <w:lsdException w:name="List Table 6 Colorful Accent 6" w:uiPriority="51"/>
     <w:lsdException w:name="List Table 7 Colorful Accent 6" w:uiPriority="52"/>
+    <w:lsdException w:name="Mention" w:semiHidden="1" w:unhideWhenUsed="1"/>
+    <w:lsdException w:name="Smart Hyperlink" w:semiHidden="1" w:unhideWhenUsed="1"/>
+    <w:lsdException w:name="Hashtag" w:semiHidden="1" w:unhideWhenUsed="1"/>
+    <w:lsdException w:name="Unresolved Mention" w:semiHidden="1" w:unhideWhenUsed="1"/>
+    <w:lsdException w:name="Smart Link" w:semiHidden="1" w:unhideWhenUsed="1"/>
   </w:latentStyles>
   <w:style w:type="paragraph" w:default="1" w:styleId="Normal">
     <w:name w:val="Normal"/>

</xml_diff>